<commit_message>
Codesets links were corrected in the tsd pdfs
</commit_message>
<xml_diff>
--- a/health_dimensions/infectious disease/hiv_prevalence_esp_id_01/hiv_prevalence_esp_tsd_v01.docx
+++ b/health_dimensions/infectious disease/hiv_prevalence_esp_id_01/hiv_prevalence_esp_tsd_v01.docx
@@ -575,7 +575,6 @@
         <w:rPr>
           <w:b/>
         </w:rPr>
-        <w:lastRenderedPageBreak/>
         <w:t>Reference Code Sets</w:t>
       </w:r>
     </w:p>
@@ -2581,6 +2580,18 @@
       <w:shd w:val="clear" w:color="auto" w:fill="E1DFDD"/>
     </w:rPr>
   </w:style>
+  <w:style w:type="character" w:styleId="FollowedHyperlink">
+    <w:name w:val="FollowedHyperlink"/>
+    <w:basedOn w:val="DefaultParagraphFont"/>
+    <w:uiPriority w:val="99"/>
+    <w:semiHidden/>
+    <w:unhideWhenUsed/>
+    <w:rsid w:val="00A424C2"/>
+    <w:rPr>
+      <w:color w:val="954F72" w:themeColor="followedHyperlink"/>
+      <w:u w:val="single"/>
+    </w:rPr>
+  </w:style>
 </w:styles>
 </file>
 

</xml_diff>